<commit_message>
Updating the resume and other details
</commit_message>
<xml_diff>
--- a/resume/Sunanda_Vempati_Resume.docx
+++ b/resume/Sunanda_Vempati_Resume.docx
@@ -15,23 +15,7 @@
           <w:color w:val="1F497D" w:themeColor="text2"/>
           <w:sz w:val="38"/>
         </w:rPr>
-        <w:t>SUNANDA</w:t>
-      </w:r>
-      <w:r>
-        <w:rPr>
-          <w:b/>
-          <w:color w:val="1F497D" w:themeColor="text2"/>
-          <w:sz w:val="38"/>
-        </w:rPr>
-        <w:t xml:space="preserve"> </w:t>
-      </w:r>
-      <w:r>
-        <w:rPr>
-          <w:b/>
-          <w:color w:val="1F497D" w:themeColor="text2"/>
-          <w:sz w:val="38"/>
-        </w:rPr>
-        <w:t>VEMPATI</w:t>
+        <w:t>SUNANDA VEMPATI</w:t>
       </w:r>
     </w:p>
     <w:p>
@@ -57,77 +41,17 @@
           <w:color w:val="000000" w:themeColor="text1"/>
         </w:rPr>
       </w:pPr>
-      <w:r>
-        <w:rPr>
-          <w:rStyle w:val="s2"/>
-          <w:color w:val="000000" w:themeColor="text1"/>
-          <w:sz w:val="28"/>
-          <w:szCs w:val="28"/>
-        </w:rPr>
-        <w:fldChar w:fldCharType="begin"/>
-      </w:r>
-      <w:r>
-        <w:rPr>
-          <w:rStyle w:val="s2"/>
-          <w:color w:val="000000" w:themeColor="text1"/>
-          <w:sz w:val="28"/>
-          <w:szCs w:val="28"/>
-        </w:rPr>
-        <w:instrText>HYPERLINK "http://su.vempati@gmail.com"</w:instrText>
-      </w:r>
-      <w:r>
-        <w:rPr>
-          <w:rStyle w:val="s2"/>
-          <w:color w:val="000000" w:themeColor="text1"/>
-          <w:sz w:val="28"/>
-          <w:szCs w:val="28"/>
-        </w:rPr>
-      </w:r>
-      <w:r>
-        <w:rPr>
-          <w:rStyle w:val="s2"/>
-          <w:color w:val="000000" w:themeColor="text1"/>
-          <w:sz w:val="28"/>
-          <w:szCs w:val="28"/>
-        </w:rPr>
-        <w:fldChar w:fldCharType="separate"/>
-      </w:r>
-      <w:r>
-        <w:rPr>
-          <w:rStyle w:val="Hyperlink"/>
-          <w:color w:val="000000" w:themeColor="text1"/>
-          <w:sz w:val="28"/>
-          <w:szCs w:val="28"/>
-        </w:rPr>
-        <w:t>su.vempati@gmail.c</w:t>
-      </w:r>
-      <w:r>
-        <w:rPr>
-          <w:rStyle w:val="Hyperlink"/>
-          <w:color w:val="000000" w:themeColor="text1"/>
-          <w:sz w:val="28"/>
-          <w:szCs w:val="28"/>
-        </w:rPr>
-        <w:t>o</w:t>
-      </w:r>
-      <w:r>
-        <w:rPr>
-          <w:rStyle w:val="Hyperlink"/>
-          <w:color w:val="000000" w:themeColor="text1"/>
-          <w:sz w:val="28"/>
-          <w:szCs w:val="28"/>
-        </w:rPr>
-        <w:t>m</w:t>
-      </w:r>
-      <w:r>
-        <w:rPr>
-          <w:rStyle w:val="s2"/>
-          <w:color w:val="000000" w:themeColor="text1"/>
-          <w:sz w:val="28"/>
-          <w:szCs w:val="28"/>
-        </w:rPr>
-        <w:fldChar w:fldCharType="end"/>
-      </w:r>
+      <w:hyperlink r:id="rId6" w:history="1">
+        <w:r>
+          <w:rPr>
+            <w:rStyle w:val="Hyperlink"/>
+            <w:color w:val="000000" w:themeColor="text1"/>
+            <w:sz w:val="28"/>
+            <w:szCs w:val="28"/>
+          </w:rPr>
+          <w:t>su.vempati@gmail.com</w:t>
+        </w:r>
+      </w:hyperlink>
       <w:r>
         <w:rPr>
           <w:color w:val="000000" w:themeColor="text1"/>
@@ -149,7 +73,7 @@
         </w:rPr>
         <w:t xml:space="preserve"> </w:t>
       </w:r>
-      <w:hyperlink r:id="rId6" w:history="1">
+      <w:hyperlink r:id="rId7" w:history="1">
         <w:r>
           <w:rPr>
             <w:rStyle w:val="Hyperlink"/>
@@ -168,44 +92,6 @@
         </w:rPr>
         <w:t xml:space="preserve"> | </w:t>
       </w:r>
-      <w:hyperlink r:id="rId7" w:history="1">
-        <w:r>
-          <w:rPr>
-            <w:rStyle w:val="Hyperlink"/>
-            <w:color w:val="000000" w:themeColor="text1"/>
-            <w:sz w:val="24"/>
-            <w:szCs w:val="24"/>
-          </w:rPr>
-          <w:t>Linked</w:t>
-        </w:r>
-        <w:r>
-          <w:rPr>
-            <w:rStyle w:val="Hyperlink"/>
-            <w:color w:val="000000" w:themeColor="text1"/>
-            <w:sz w:val="24"/>
-            <w:szCs w:val="24"/>
-          </w:rPr>
-          <w:t>I</w:t>
-        </w:r>
-        <w:r>
-          <w:rPr>
-            <w:rStyle w:val="Hyperlink"/>
-            <w:color w:val="000000" w:themeColor="text1"/>
-            <w:sz w:val="24"/>
-            <w:szCs w:val="24"/>
-          </w:rPr>
-          <w:t>n</w:t>
-        </w:r>
-      </w:hyperlink>
-      <w:r>
-        <w:rPr>
-          <w:rStyle w:val="s2"/>
-          <w:color w:val="000000" w:themeColor="text1"/>
-          <w:sz w:val="24"/>
-          <w:szCs w:val="24"/>
-        </w:rPr>
-        <w:t xml:space="preserve">| </w:t>
-      </w:r>
       <w:hyperlink r:id="rId8" w:history="1">
         <w:r>
           <w:rPr>
@@ -214,8 +100,19 @@
             <w:sz w:val="24"/>
             <w:szCs w:val="24"/>
           </w:rPr>
-          <w:t>Portfoli</w:t>
+          <w:t>LinkedIn</w:t>
         </w:r>
+      </w:hyperlink>
+      <w:r>
+        <w:rPr>
+          <w:rStyle w:val="s2"/>
+          <w:color w:val="000000" w:themeColor="text1"/>
+          <w:sz w:val="24"/>
+          <w:szCs w:val="24"/>
+        </w:rPr>
+        <w:t xml:space="preserve">| </w:t>
+      </w:r>
+      <w:hyperlink r:id="rId9" w:history="1">
         <w:r>
           <w:rPr>
             <w:rStyle w:val="Hyperlink"/>
@@ -223,7 +120,7 @@
             <w:sz w:val="24"/>
             <w:szCs w:val="24"/>
           </w:rPr>
-          <w:t>o</w:t>
+          <w:t>Portfolio</w:t>
         </w:r>
       </w:hyperlink>
     </w:p>
@@ -545,16 +442,7 @@
           <w:sz w:val="21"/>
           <w:szCs w:val="28"/>
         </w:rPr>
-        <w:t xml:space="preserve">Blockchain </w:t>
-      </w:r>
-      <w:proofErr w:type="gramStart"/>
-      <w:r>
-        <w:rPr>
-          <w:b/>
-          <w:sz w:val="21"/>
-          <w:szCs w:val="28"/>
-        </w:rPr>
-        <w:t>Consultant</w:t>
+        <w:t>Blockchain Consultant Freelancer</w:t>
       </w:r>
       <w:r>
         <w:rPr>
@@ -562,16 +450,7 @@
           <w:sz w:val="21"/>
           <w:szCs w:val="28"/>
         </w:rPr>
-        <w:t xml:space="preserve">  May</w:t>
-      </w:r>
-      <w:proofErr w:type="gramEnd"/>
-      <w:r>
-        <w:rPr>
-          <w:i/>
-          <w:sz w:val="21"/>
-          <w:szCs w:val="28"/>
-        </w:rPr>
-        <w:t xml:space="preserve"> 2026 – Present</w:t>
+        <w:t xml:space="preserve"> May 2026 – Present</w:t>
       </w:r>
     </w:p>
     <w:p>
@@ -738,7 +617,7 @@
           <w:sz w:val="21"/>
           <w:szCs w:val="28"/>
         </w:rPr>
-        <w:t>G Future Tech | Lead Blockchain Developer</w:t>
+        <w:t>Maavatar | Smart Contract / Web3 Manager / Blockchain SME</w:t>
       </w:r>
       <w:r>
         <w:rPr>
@@ -746,7 +625,7 @@
           <w:sz w:val="21"/>
           <w:szCs w:val="28"/>
         </w:rPr>
-        <w:t xml:space="preserve">  Oct 2024 – Jul 2026</w:t>
+        <w:t xml:space="preserve">  Dec 2024 – Feb 2026</w:t>
       </w:r>
     </w:p>
     <w:p>
@@ -763,24 +642,7 @@
           <w:szCs w:val="28"/>
         </w:rPr>
         <w:lastRenderedPageBreak/>
-        <w:t>Worked on crypto-backed and RWA-backed financial ecosystems, combining smart-contract engineering with protocol architecture, governance, DeFi and blockchain SME responsibilities.</w:t>
-      </w:r>
-    </w:p>
-    <w:p>
-      <w:pPr>
-        <w:spacing w:after="40"/>
-        <w:rPr>
-          <w:sz w:val="21"/>
-          <w:szCs w:val="28"/>
-        </w:rPr>
-      </w:pPr>
-      <w:r>
-        <w:rPr>
-          <w:b/>
-          <w:sz w:val="21"/>
-          <w:szCs w:val="28"/>
-        </w:rPr>
-        <w:t>REAL Governance</w:t>
+        <w:t>Core blockchain SME and technical contributor to the development of a blockchain-powered metaverse ecosystem supporting digital identity, assets, NFTs, ownership and Web3 interactions.</w:t>
       </w:r>
     </w:p>
     <w:p>
@@ -802,7 +664,7 @@
           <w:sz w:val="21"/>
           <w:szCs w:val="28"/>
         </w:rPr>
-        <w:t>Contributed to smart-contract and protocol infrastructure for blockchain-based governance and on-chain execution.</w:t>
+        <w:t>Designed and developed Solidity smart contracts and ERC-1155 dynamic NFT infrastructure.</w:t>
       </w:r>
     </w:p>
     <w:p>
@@ -824,24 +686,7 @@
           <w:sz w:val="21"/>
           <w:szCs w:val="28"/>
         </w:rPr>
-        <w:t>Worked across governance mechanisms, protocol logic, testing, security and deployment workflows.</w:t>
-      </w:r>
-    </w:p>
-    <w:p>
-      <w:pPr>
-        <w:spacing w:after="40"/>
-        <w:rPr>
-          <w:sz w:val="21"/>
-          <w:szCs w:val="28"/>
-        </w:rPr>
-      </w:pPr>
-      <w:r>
-        <w:rPr>
-          <w:b/>
-          <w:sz w:val="21"/>
-          <w:szCs w:val="28"/>
-        </w:rPr>
-        <w:t>USDAO</w:t>
+        <w:t>Worked on mutable metadata, evolving digital identities, NFT tiers and digital asset ownership.</w:t>
       </w:r>
     </w:p>
     <w:p>
@@ -863,7 +708,7 @@
           <w:sz w:val="21"/>
           <w:szCs w:val="28"/>
         </w:rPr>
-        <w:t>Contributed to crypto-backed and RWA-backed financial infrastructure, including stablecoin and DeFi mechanisms.</w:t>
+        <w:t>Supported wallet connectivity, Web3 integration and interoperability across NFT, DeFi and DAO components.</w:t>
       </w:r>
     </w:p>
     <w:p>
@@ -885,7 +730,7 @@
           <w:sz w:val="21"/>
           <w:szCs w:val="28"/>
         </w:rPr>
-        <w:t>Worked across collateralization, lending/borrowing, liquidity, governance, oracle integration and liquidation/recovery mechanisms.</w:t>
+        <w:t>Provided blockchain technical direction and helped translate metaverse product requirements into on-chain architecture.</w:t>
       </w:r>
     </w:p>
     <w:p>
@@ -907,11 +752,36 @@
           <w:sz w:val="21"/>
           <w:szCs w:val="28"/>
         </w:rPr>
-        <w:t>Contributed to smart-contract architecture, protocol development, security analysis and deployment.</w:t>
+        <w:t>Contributed to architecture decisions, security analysis, testing, deployment and blockchain/application integration.</w:t>
       </w:r>
     </w:p>
     <w:p>
       <w:pPr>
+        <w:spacing w:before="80" w:after="20"/>
+        <w:rPr>
+          <w:sz w:val="21"/>
+          <w:szCs w:val="28"/>
+        </w:rPr>
+      </w:pPr>
+      <w:r>
+        <w:rPr>
+          <w:b/>
+          <w:sz w:val="21"/>
+          <w:szCs w:val="28"/>
+        </w:rPr>
+        <w:t>G Future Tech | Lead Blockchain Developer</w:t>
+      </w:r>
+      <w:r>
+        <w:rPr>
+          <w:i/>
+          <w:sz w:val="21"/>
+          <w:szCs w:val="28"/>
+        </w:rPr>
+        <w:t xml:space="preserve">  Consultant Freelancer</w:t>
+      </w:r>
+    </w:p>
+    <w:p>
+      <w:pPr>
         <w:spacing w:after="40"/>
         <w:rPr>
           <w:sz w:val="21"/>
@@ -920,11 +790,27 @@
       </w:pPr>
       <w:r>
         <w:rPr>
+          <w:sz w:val="21"/>
+          <w:szCs w:val="28"/>
+        </w:rPr>
+        <w:t>Worked on crypto-backed and RWA-backed financial ecosystems, combining smart-contract engineering with protocol architecture, governance, DeFi and blockchain SME responsibilities.</w:t>
+      </w:r>
+    </w:p>
+    <w:p>
+      <w:pPr>
+        <w:spacing w:after="40"/>
+        <w:rPr>
+          <w:sz w:val="21"/>
+          <w:szCs w:val="28"/>
+        </w:rPr>
+      </w:pPr>
+      <w:r>
+        <w:rPr>
           <w:b/>
           <w:sz w:val="21"/>
           <w:szCs w:val="28"/>
         </w:rPr>
-        <w:t>Technical Leadership</w:t>
+        <w:t>REAL Governance</w:t>
       </w:r>
     </w:p>
     <w:p>
@@ -946,7 +832,7 @@
           <w:sz w:val="21"/>
           <w:szCs w:val="28"/>
         </w:rPr>
-        <w:t>Provided blockchain SME expertise and technical guidance across architecture and implementation decisions.</w:t>
+        <w:t>Contributed to smart-contract and protocol infrastructure for blockchain-based governance and on-chain execution.</w:t>
       </w:r>
     </w:p>
     <w:p>
@@ -968,7 +854,24 @@
           <w:sz w:val="21"/>
           <w:szCs w:val="28"/>
         </w:rPr>
-        <w:t>Translated product requirements into blockchain solutions and collaborated with engineering/product stakeholders.</w:t>
+        <w:t>Worked across governance mechanisms, protocol logic, testing, security and deployment workflows.</w:t>
+      </w:r>
+    </w:p>
+    <w:p>
+      <w:pPr>
+        <w:spacing w:after="40"/>
+        <w:rPr>
+          <w:sz w:val="21"/>
+          <w:szCs w:val="28"/>
+        </w:rPr>
+      </w:pPr>
+      <w:r>
+        <w:rPr>
+          <w:b/>
+          <w:sz w:val="21"/>
+          <w:szCs w:val="28"/>
+        </w:rPr>
+        <w:t>USDAO</w:t>
       </w:r>
     </w:p>
     <w:p>
@@ -990,48 +893,7 @@
           <w:sz w:val="21"/>
           <w:szCs w:val="28"/>
         </w:rPr>
-        <w:t>Supported testing, security reviews, audit preparation and production-oriented deployment.</w:t>
-      </w:r>
-    </w:p>
-    <w:p>
-      <w:pPr>
-        <w:spacing w:before="80" w:after="20"/>
-        <w:rPr>
-          <w:sz w:val="21"/>
-          <w:szCs w:val="28"/>
-        </w:rPr>
-      </w:pPr>
-      <w:r>
-        <w:rPr>
-          <w:b/>
-          <w:sz w:val="21"/>
-          <w:szCs w:val="28"/>
-        </w:rPr>
-        <w:t>Maavatar | Smart Contract Manager / Blockchain SME (consultant)</w:t>
-      </w:r>
-      <w:r>
-        <w:rPr>
-          <w:i/>
-          <w:sz w:val="21"/>
-          <w:szCs w:val="28"/>
-        </w:rPr>
-        <w:t xml:space="preserve">  Dec 2024 – Feb 2026</w:t>
-      </w:r>
-    </w:p>
-    <w:p>
-      <w:pPr>
-        <w:spacing w:after="40"/>
-        <w:rPr>
-          <w:sz w:val="21"/>
-          <w:szCs w:val="28"/>
-        </w:rPr>
-      </w:pPr>
-      <w:r>
-        <w:rPr>
-          <w:sz w:val="21"/>
-          <w:szCs w:val="28"/>
-        </w:rPr>
-        <w:t>Core blockchain SME and technical contributor to the development of a blockchain-powered metaverse ecosystem supporting digital identity, assets, NFTs, ownership and Web3 interactions.</w:t>
+        <w:t>Contributed to crypto-backed and RWA-backed financial infrastructure, including stablecoin and DeFi mechanisms.</w:t>
       </w:r>
     </w:p>
     <w:p>
@@ -1053,7 +915,7 @@
           <w:sz w:val="21"/>
           <w:szCs w:val="28"/>
         </w:rPr>
-        <w:t>Designed and developed Solidity smart contracts and ERC-1155 dynamic NFT infrastructure.</w:t>
+        <w:t>Worked across collateralization, lending/borrowing, liquidity, governance, oracle integration and liquidation/recovery mechanisms.</w:t>
       </w:r>
     </w:p>
     <w:p>
@@ -1075,7 +937,24 @@
           <w:sz w:val="21"/>
           <w:szCs w:val="28"/>
         </w:rPr>
-        <w:t>Worked on mutable metadata, evolving digital identities, NFT tiers and digital asset ownership.</w:t>
+        <w:t>Contributed to smart-contract architecture, protocol development, security analysis and deployment.</w:t>
+      </w:r>
+    </w:p>
+    <w:p>
+      <w:pPr>
+        <w:spacing w:after="40"/>
+        <w:rPr>
+          <w:sz w:val="21"/>
+          <w:szCs w:val="28"/>
+        </w:rPr>
+      </w:pPr>
+      <w:r>
+        <w:rPr>
+          <w:b/>
+          <w:sz w:val="21"/>
+          <w:szCs w:val="28"/>
+        </w:rPr>
+        <w:t>Technical Leadership</w:t>
       </w:r>
     </w:p>
     <w:p>
@@ -1097,7 +976,7 @@
           <w:sz w:val="21"/>
           <w:szCs w:val="28"/>
         </w:rPr>
-        <w:t>Supported wallet connectivity, Web3 integration and interoperability across NFT, DeFi and DAO components.</w:t>
+        <w:t>Provided blockchain SME expertise and technical guidance across architecture and implementation decisions.</w:t>
       </w:r>
     </w:p>
     <w:p>
@@ -1119,7 +998,7 @@
           <w:sz w:val="21"/>
           <w:szCs w:val="28"/>
         </w:rPr>
-        <w:t>Provided blockchain technical direction and helped translate metaverse product requirements into on-chain architecture.</w:t>
+        <w:t>Translated product requirements into blockchain solutions and collaborated with engineering/product stakeholders.</w:t>
       </w:r>
     </w:p>
     <w:p>
@@ -1141,7 +1020,7 @@
           <w:sz w:val="21"/>
           <w:szCs w:val="28"/>
         </w:rPr>
-        <w:t>Contributed to architecture decisions, security analysis, testing, deployment and blockchain/application integration.</w:t>
+        <w:t>Supported testing, security reviews, audit preparation and production-oriented deployment.</w:t>
       </w:r>
     </w:p>
     <w:p>

</xml_diff>

<commit_message>
changing the name of the resumes
</commit_message>
<xml_diff>
--- a/resume/Sunanda_Vempati_Resume.docx
+++ b/resume/Sunanda_Vempati_Resume.docx
@@ -15,7 +15,23 @@
           <w:color w:val="1F497D" w:themeColor="text2"/>
           <w:sz w:val="38"/>
         </w:rPr>
-        <w:t>SUNANDA VEMPATI</w:t>
+        <w:t>SUNANDA</w:t>
+      </w:r>
+      <w:r>
+        <w:rPr>
+          <w:b/>
+          <w:color w:val="1F497D" w:themeColor="text2"/>
+          <w:sz w:val="38"/>
+        </w:rPr>
+        <w:t xml:space="preserve"> </w:t>
+      </w:r>
+      <w:r>
+        <w:rPr>
+          <w:b/>
+          <w:color w:val="1F497D" w:themeColor="text2"/>
+          <w:sz w:val="38"/>
+        </w:rPr>
+        <w:t>VEMPATI</w:t>
       </w:r>
     </w:p>
     <w:p>
@@ -41,17 +57,77 @@
           <w:color w:val="000000" w:themeColor="text1"/>
         </w:rPr>
       </w:pPr>
-      <w:hyperlink r:id="rId6" w:history="1">
-        <w:r>
-          <w:rPr>
-            <w:rStyle w:val="Hyperlink"/>
-            <w:color w:val="000000" w:themeColor="text1"/>
-            <w:sz w:val="28"/>
-            <w:szCs w:val="28"/>
-          </w:rPr>
-          <w:t>su.vempati@gmail.com</w:t>
-        </w:r>
-      </w:hyperlink>
+      <w:r>
+        <w:rPr>
+          <w:rStyle w:val="s2"/>
+          <w:color w:val="000000" w:themeColor="text1"/>
+          <w:sz w:val="28"/>
+          <w:szCs w:val="28"/>
+        </w:rPr>
+        <w:fldChar w:fldCharType="begin"/>
+      </w:r>
+      <w:r>
+        <w:rPr>
+          <w:rStyle w:val="s2"/>
+          <w:color w:val="000000" w:themeColor="text1"/>
+          <w:sz w:val="28"/>
+          <w:szCs w:val="28"/>
+        </w:rPr>
+        <w:instrText>HYPERLINK "http://su.vempati@gmail.com"</w:instrText>
+      </w:r>
+      <w:r>
+        <w:rPr>
+          <w:rStyle w:val="s2"/>
+          <w:color w:val="000000" w:themeColor="text1"/>
+          <w:sz w:val="28"/>
+          <w:szCs w:val="28"/>
+        </w:rPr>
+      </w:r>
+      <w:r>
+        <w:rPr>
+          <w:rStyle w:val="s2"/>
+          <w:color w:val="000000" w:themeColor="text1"/>
+          <w:sz w:val="28"/>
+          <w:szCs w:val="28"/>
+        </w:rPr>
+        <w:fldChar w:fldCharType="separate"/>
+      </w:r>
+      <w:r>
+        <w:rPr>
+          <w:rStyle w:val="Hyperlink"/>
+          <w:color w:val="000000" w:themeColor="text1"/>
+          <w:sz w:val="28"/>
+          <w:szCs w:val="28"/>
+        </w:rPr>
+        <w:t>su.vempati@gmail.c</w:t>
+      </w:r>
+      <w:r>
+        <w:rPr>
+          <w:rStyle w:val="Hyperlink"/>
+          <w:color w:val="000000" w:themeColor="text1"/>
+          <w:sz w:val="28"/>
+          <w:szCs w:val="28"/>
+        </w:rPr>
+        <w:t>o</w:t>
+      </w:r>
+      <w:r>
+        <w:rPr>
+          <w:rStyle w:val="Hyperlink"/>
+          <w:color w:val="000000" w:themeColor="text1"/>
+          <w:sz w:val="28"/>
+          <w:szCs w:val="28"/>
+        </w:rPr>
+        <w:t>m</w:t>
+      </w:r>
+      <w:r>
+        <w:rPr>
+          <w:rStyle w:val="s2"/>
+          <w:color w:val="000000" w:themeColor="text1"/>
+          <w:sz w:val="28"/>
+          <w:szCs w:val="28"/>
+        </w:rPr>
+        <w:fldChar w:fldCharType="end"/>
+      </w:r>
       <w:r>
         <w:rPr>
           <w:color w:val="000000" w:themeColor="text1"/>
@@ -73,7 +149,7 @@
         </w:rPr>
         <w:t xml:space="preserve"> </w:t>
       </w:r>
-      <w:hyperlink r:id="rId7" w:history="1">
+      <w:hyperlink r:id="rId6" w:history="1">
         <w:r>
           <w:rPr>
             <w:rStyle w:val="Hyperlink"/>
@@ -92,6 +168,44 @@
         </w:rPr>
         <w:t xml:space="preserve"> | </w:t>
       </w:r>
+      <w:hyperlink r:id="rId7" w:history="1">
+        <w:r>
+          <w:rPr>
+            <w:rStyle w:val="Hyperlink"/>
+            <w:color w:val="000000" w:themeColor="text1"/>
+            <w:sz w:val="24"/>
+            <w:szCs w:val="24"/>
+          </w:rPr>
+          <w:t>Linked</w:t>
+        </w:r>
+        <w:r>
+          <w:rPr>
+            <w:rStyle w:val="Hyperlink"/>
+            <w:color w:val="000000" w:themeColor="text1"/>
+            <w:sz w:val="24"/>
+            <w:szCs w:val="24"/>
+          </w:rPr>
+          <w:t>I</w:t>
+        </w:r>
+        <w:r>
+          <w:rPr>
+            <w:rStyle w:val="Hyperlink"/>
+            <w:color w:val="000000" w:themeColor="text1"/>
+            <w:sz w:val="24"/>
+            <w:szCs w:val="24"/>
+          </w:rPr>
+          <w:t>n</w:t>
+        </w:r>
+      </w:hyperlink>
+      <w:r>
+        <w:rPr>
+          <w:rStyle w:val="s2"/>
+          <w:color w:val="000000" w:themeColor="text1"/>
+          <w:sz w:val="24"/>
+          <w:szCs w:val="24"/>
+        </w:rPr>
+        <w:t xml:space="preserve">| </w:t>
+      </w:r>
       <w:hyperlink r:id="rId8" w:history="1">
         <w:r>
           <w:rPr>
@@ -100,19 +214,8 @@
             <w:sz w:val="24"/>
             <w:szCs w:val="24"/>
           </w:rPr>
-          <w:t>LinkedIn</w:t>
+          <w:t>Portfoli</w:t>
         </w:r>
-      </w:hyperlink>
-      <w:r>
-        <w:rPr>
-          <w:rStyle w:val="s2"/>
-          <w:color w:val="000000" w:themeColor="text1"/>
-          <w:sz w:val="24"/>
-          <w:szCs w:val="24"/>
-        </w:rPr>
-        <w:t xml:space="preserve">| </w:t>
-      </w:r>
-      <w:hyperlink r:id="rId9" w:history="1">
         <w:r>
           <w:rPr>
             <w:rStyle w:val="Hyperlink"/>
@@ -120,7 +223,7 @@
             <w:sz w:val="24"/>
             <w:szCs w:val="24"/>
           </w:rPr>
-          <w:t>Portfolio</w:t>
+          <w:t>o</w:t>
         </w:r>
       </w:hyperlink>
     </w:p>
@@ -410,47 +513,37 @@
           <w:szCs w:val="28"/>
         </w:rPr>
       </w:pPr>
-      <w:proofErr w:type="spellStart"/>
       <w:r>
         <w:rPr>
           <w:b/>
           <w:sz w:val="21"/>
           <w:szCs w:val="28"/>
         </w:rPr>
-        <w:t>AppMindsGlobal</w:t>
-      </w:r>
-      <w:proofErr w:type="spellEnd"/>
-      <w:r>
-        <w:rPr>
-          <w:b/>
-          <w:sz w:val="21"/>
-          <w:szCs w:val="28"/>
-        </w:rPr>
-        <w:t xml:space="preserve"> | </w:t>
+        <w:t>Maavatar | Smart Contract Manager / Blockchain SME (Full-time)</w:t>
       </w:r>
       <w:r>
         <w:rPr>
-          <w:b/>
-          <w:sz w:val="21"/>
-          <w:szCs w:val="28"/>
-        </w:rPr>
-        <w:t>SME-</w:t>
+          <w:i/>
+          <w:sz w:val="21"/>
+          <w:szCs w:val="28"/>
+        </w:rPr>
+        <w:t xml:space="preserve">  Dec 2024 – Feb 2026</w:t>
       </w:r>
+    </w:p>
+    <w:p>
+      <w:pPr>
+        <w:spacing w:after="40"/>
+        <w:rPr>
+          <w:sz w:val="21"/>
+          <w:szCs w:val="28"/>
+        </w:rPr>
+      </w:pPr>
       <w:r>
         <w:rPr>
-          <w:b/>
-          <w:sz w:val="21"/>
-          <w:szCs w:val="28"/>
-        </w:rPr>
-        <w:t>Blockchain Consultant Freelancer</w:t>
-      </w:r>
-      <w:r>
-        <w:rPr>
-          <w:i/>
-          <w:sz w:val="21"/>
-          <w:szCs w:val="28"/>
-        </w:rPr>
-        <w:t xml:space="preserve"> May 2026 – Present</w:t>
+          <w:sz w:val="21"/>
+          <w:szCs w:val="28"/>
+        </w:rPr>
+        <w:t>Core blockchain SME and technical contributor to the development of a blockchain-powered metaverse ecosystem supporting digital identity, assets, NFTs, ownership and Web3 interactions.</w:t>
       </w:r>
     </w:p>
     <w:p>
@@ -472,7 +565,7 @@
           <w:sz w:val="21"/>
           <w:szCs w:val="28"/>
         </w:rPr>
-        <w:t>Design and develop multi-chain token and RWA infrastructure across EVM and Solana-oriented environments.</w:t>
+        <w:t>Designed and developed Solidity smart contracts and ERC-1155 dynamic NFT infrastructure.</w:t>
       </w:r>
     </w:p>
     <w:p>
@@ -494,7 +587,7 @@
           <w:sz w:val="21"/>
           <w:szCs w:val="28"/>
         </w:rPr>
-        <w:t>Work across token deployment, bridging, vesting, staking and token lifecycle architecture.</w:t>
+        <w:t>Worked on mutable metadata, evolving digital identities, NFT tiers and digital asset ownership.</w:t>
       </w:r>
     </w:p>
     <w:p>
@@ -516,7 +609,7 @@
           <w:sz w:val="21"/>
           <w:szCs w:val="28"/>
         </w:rPr>
-        <w:t>Contribute to CREATE2 deterministic deployment and LayerZero V2/OFT-oriented cross-chain architecture.</w:t>
+        <w:t>Supported wallet connectivity, Web3 integration and interoperability across NFT, DeFi and DAO components.</w:t>
       </w:r>
     </w:p>
     <w:p>
@@ -538,7 +631,7 @@
           <w:sz w:val="21"/>
           <w:szCs w:val="28"/>
         </w:rPr>
-        <w:t>Build and support deployment automation, contract verification, testing, security review and audit handoff.</w:t>
+        <w:t>Provided blockchain technical direction and helped translate metaverse product requirements into on-chain architecture.</w:t>
       </w:r>
     </w:p>
     <w:p>
@@ -560,12 +653,12 @@
           <w:sz w:val="21"/>
           <w:szCs w:val="28"/>
         </w:rPr>
-        <w:t>Translate business requirements into blockchain architecture and provide technical consulting.</w:t>
+        <w:t>Contributed to architecture decisions, security analysis, testing, deployment and blockchain/application integration.</w:t>
       </w:r>
     </w:p>
     <w:p>
       <w:pPr>
-        <w:spacing w:after="40"/>
+        <w:spacing w:before="80" w:after="20"/>
         <w:rPr>
           <w:sz w:val="21"/>
           <w:szCs w:val="28"/>
@@ -577,72 +670,15 @@
           <w:sz w:val="21"/>
           <w:szCs w:val="28"/>
         </w:rPr>
-        <w:t>Featured:</w:t>
+        <w:t>Brane Enterprises Pvt. Ltd. | Senior Blockchain Developer</w:t>
       </w:r>
       <w:r>
         <w:rPr>
-          <w:sz w:val="21"/>
-          <w:szCs w:val="28"/>
-        </w:rPr>
-        <w:t xml:space="preserve"> RBC / FRK — Multi-Chain Token Infrastructure</w:t>
-      </w:r>
-    </w:p>
-    <w:p>
-      <w:pPr>
-        <w:spacing w:after="40"/>
-        <w:rPr>
-          <w:sz w:val="21"/>
-          <w:szCs w:val="28"/>
-        </w:rPr>
-      </w:pPr>
-      <w:r>
-        <w:rPr>
-          <w:sz w:val="21"/>
-          <w:szCs w:val="28"/>
-        </w:rPr>
-        <w:t>Multi-chain token deployment, deterministic CREATE2 architecture, cross-chain infrastructure, LayerZero-oriented design, deployment automation and contract verification.</w:t>
-      </w:r>
-    </w:p>
-    <w:p>
-      <w:pPr>
-        <w:spacing w:before="80" w:after="20"/>
-        <w:rPr>
-          <w:sz w:val="21"/>
-          <w:szCs w:val="28"/>
-        </w:rPr>
-      </w:pPr>
-      <w:r>
-        <w:rPr>
-          <w:b/>
-          <w:sz w:val="21"/>
-          <w:szCs w:val="28"/>
-        </w:rPr>
-        <w:t>Maavatar | Smart Contract / Web3 Manager / Blockchain SME</w:t>
-      </w:r>
-      <w:r>
-        <w:rPr>
           <w:i/>
           <w:sz w:val="21"/>
           <w:szCs w:val="28"/>
         </w:rPr>
-        <w:t xml:space="preserve">  Dec 2024 – Feb 2026</w:t>
-      </w:r>
-    </w:p>
-    <w:p>
-      <w:pPr>
-        <w:spacing w:after="40"/>
-        <w:rPr>
-          <w:sz w:val="21"/>
-          <w:szCs w:val="28"/>
-        </w:rPr>
-      </w:pPr>
-      <w:r>
-        <w:rPr>
-          <w:sz w:val="21"/>
-          <w:szCs w:val="28"/>
-        </w:rPr>
-        <w:lastRenderedPageBreak/>
-        <w:t>Core blockchain SME and technical contributor to the development of a blockchain-powered metaverse ecosystem supporting digital identity, assets, NFTs, ownership and Web3 interactions.</w:t>
+        <w:t xml:space="preserve">  Aug 2022 – Nov 2024</w:t>
       </w:r>
     </w:p>
     <w:p>
@@ -664,7 +700,7 @@
           <w:sz w:val="21"/>
           <w:szCs w:val="28"/>
         </w:rPr>
-        <w:t>Designed and developed Solidity smart contracts and ERC-1155 dynamic NFT infrastructure.</w:t>
+        <w:t>Designed, developed, tested and deployed Solidity smart contracts and decentralized applications.</w:t>
       </w:r>
     </w:p>
     <w:p>
@@ -686,7 +722,7 @@
           <w:sz w:val="21"/>
           <w:szCs w:val="28"/>
         </w:rPr>
-        <w:t>Worked on mutable metadata, evolving digital identities, NFT tiers and digital asset ownership.</w:t>
+        <w:t>Worked across token infrastructure, Web3 integrations and EVM-compatible blockchain environments.</w:t>
       </w:r>
     </w:p>
     <w:p>
@@ -708,7 +744,7 @@
           <w:sz w:val="21"/>
           <w:szCs w:val="28"/>
         </w:rPr>
-        <w:t>Supported wallet connectivity, Web3 integration and interoperability across NFT, DeFi and DAO components.</w:t>
+        <w:t>Contributed to smart-contract architecture, security reviews, vulnerability analysis and gas optimization.</w:t>
       </w:r>
     </w:p>
     <w:p>
@@ -730,7 +766,231 @@
           <w:sz w:val="21"/>
           <w:szCs w:val="28"/>
         </w:rPr>
-        <w:t>Provided blockchain technical direction and helped translate metaverse product requirements into on-chain architecture.</w:t>
+        <w:t>Supported blockchain integrations, deployment and production troubleshooting.</w:t>
+      </w:r>
+    </w:p>
+    <w:p>
+      <w:pPr>
+        <w:spacing w:before="80" w:after="20"/>
+        <w:rPr>
+          <w:sz w:val="21"/>
+          <w:szCs w:val="28"/>
+        </w:rPr>
+      </w:pPr>
+      <w:r>
+        <w:rPr>
+          <w:b/>
+          <w:sz w:val="21"/>
+          <w:szCs w:val="28"/>
+        </w:rPr>
+        <w:t>G Future Tech Pvt. Ltd. | Blockchain Developer</w:t>
+      </w:r>
+      <w:r>
+        <w:rPr>
+          <w:i/>
+          <w:sz w:val="21"/>
+          <w:szCs w:val="28"/>
+        </w:rPr>
+        <w:t xml:space="preserve">  Apr 2021 – Aug 2022</w:t>
+      </w:r>
+    </w:p>
+    <w:p>
+      <w:pPr>
+        <w:spacing w:after="40"/>
+        <w:ind w:left="720"/>
+        <w:rPr>
+          <w:sz w:val="21"/>
+          <w:szCs w:val="28"/>
+        </w:rPr>
+      </w:pPr>
+      <w:r>
+        <w:rPr>
+          <w:sz w:val="21"/>
+          <w:szCs w:val="28"/>
+        </w:rPr>
+        <w:t>Developed Solidity smart contracts and blockchain applications across EVM environments, supporting token functionality, Web3 integration, testing, deployment, verification and security analysis.</w:t>
+      </w:r>
+    </w:p>
+    <w:p>
+      <w:pPr>
+        <w:spacing w:before="80" w:after="20"/>
+        <w:rPr>
+          <w:sz w:val="21"/>
+          <w:szCs w:val="28"/>
+        </w:rPr>
+      </w:pPr>
+      <w:r>
+        <w:rPr>
+          <w:b/>
+          <w:sz w:val="21"/>
+          <w:szCs w:val="28"/>
+        </w:rPr>
+        <w:t>Zeromile Research &amp; Development LLC | Blockchain Developer</w:t>
+      </w:r>
+      <w:r>
+        <w:rPr>
+          <w:i/>
+          <w:sz w:val="21"/>
+          <w:szCs w:val="28"/>
+        </w:rPr>
+        <w:t xml:space="preserve">  Feb 2021 – Mar 2021</w:t>
+      </w:r>
+    </w:p>
+    <w:p>
+      <w:pPr>
+        <w:spacing w:after="40"/>
+        <w:ind w:firstLine="720"/>
+        <w:rPr>
+          <w:sz w:val="21"/>
+          <w:szCs w:val="28"/>
+        </w:rPr>
+      </w:pPr>
+      <w:r>
+        <w:rPr>
+          <w:sz w:val="21"/>
+          <w:szCs w:val="28"/>
+        </w:rPr>
+        <w:t>Contributed to smart-contract development, decentralized application implementation, testing and blockchain integration.</w:t>
+      </w:r>
+    </w:p>
+    <w:p>
+      <w:pPr>
+        <w:spacing w:before="80" w:after="20"/>
+        <w:rPr>
+          <w:sz w:val="21"/>
+          <w:szCs w:val="28"/>
+        </w:rPr>
+      </w:pPr>
+      <w:r>
+        <w:rPr>
+          <w:b/>
+          <w:sz w:val="21"/>
+          <w:szCs w:val="28"/>
+        </w:rPr>
+        <w:t>ThynkBlynk Technologies | Blockchain Intern</w:t>
+      </w:r>
+      <w:r>
+        <w:rPr>
+          <w:i/>
+          <w:sz w:val="21"/>
+          <w:szCs w:val="28"/>
+        </w:rPr>
+        <w:t xml:space="preserve">  Sep 2020 – Dec 2020</w:t>
+      </w:r>
+    </w:p>
+    <w:p>
+      <w:pPr>
+        <w:spacing w:after="40"/>
+        <w:ind w:firstLine="720"/>
+        <w:rPr>
+          <w:sz w:val="21"/>
+          <w:szCs w:val="28"/>
+        </w:rPr>
+      </w:pPr>
+      <w:r>
+        <w:rPr>
+          <w:sz w:val="21"/>
+          <w:szCs w:val="28"/>
+        </w:rPr>
+        <w:t>Built foundational hands-on experience in Solidity, smart contracts and decentralized application development.</w:t>
+      </w:r>
+    </w:p>
+    <w:p>
+      <w:pPr>
+        <w:spacing w:after="40"/>
+        <w:rPr>
+          <w:sz w:val="21"/>
+          <w:szCs w:val="28"/>
+        </w:rPr>
+      </w:pPr>
+    </w:p>
+    <w:p>
+      <w:pPr>
+        <w:pBdr>
+          <w:bottom w:val="single" w:sz="6" w:space="3" w:color="808080"/>
+        </w:pBdr>
+        <w:spacing w:before="120" w:after="60"/>
+        <w:rPr>
+          <w:sz w:val="21"/>
+          <w:szCs w:val="28"/>
+        </w:rPr>
+      </w:pPr>
+      <w:r>
+        <w:rPr>
+          <w:b/>
+          <w:sz w:val="28"/>
+          <w:szCs w:val="28"/>
+        </w:rPr>
+        <w:t>FREELANCE &amp; CONSULTING</w:t>
+      </w:r>
+    </w:p>
+    <w:p>
+      <w:pPr>
+        <w:spacing w:before="80" w:after="20"/>
+        <w:rPr>
+          <w:sz w:val="21"/>
+          <w:szCs w:val="28"/>
+        </w:rPr>
+      </w:pPr>
+      <w:proofErr w:type="spellStart"/>
+      <w:r>
+        <w:rPr>
+          <w:b/>
+          <w:sz w:val="21"/>
+          <w:szCs w:val="28"/>
+        </w:rPr>
+        <w:t>AppMindsGlobal</w:t>
+      </w:r>
+      <w:proofErr w:type="spellEnd"/>
+      <w:r>
+        <w:rPr>
+          <w:b/>
+          <w:sz w:val="21"/>
+          <w:szCs w:val="28"/>
+        </w:rPr>
+        <w:t xml:space="preserve"> | </w:t>
+      </w:r>
+      <w:r>
+        <w:rPr>
+          <w:b/>
+          <w:sz w:val="21"/>
+          <w:szCs w:val="28"/>
+        </w:rPr>
+        <w:t>SME-</w:t>
+      </w:r>
+      <w:r>
+        <w:rPr>
+          <w:b/>
+          <w:sz w:val="21"/>
+          <w:szCs w:val="28"/>
+        </w:rPr>
+        <w:t xml:space="preserve">Blockchain </w:t>
+      </w:r>
+      <w:proofErr w:type="gramStart"/>
+      <w:r>
+        <w:rPr>
+          <w:b/>
+          <w:sz w:val="21"/>
+          <w:szCs w:val="28"/>
+        </w:rPr>
+        <w:t>Consultant (Freelance)</w:t>
+      </w:r>
+      <w:r>
+        <w:rPr>
+          <w:i/>
+          <w:sz w:val="21"/>
+          <w:szCs w:val="28"/>
+        </w:rPr>
+        <w:t xml:space="preserve">  May</w:t>
+      </w:r>
+      <w:proofErr w:type="gramEnd"/>
+      <w:r>
+        <w:rPr>
+          <w:i/>
+          <w:sz w:val="21"/>
+          <w:szCs w:val="28"/>
+        </w:rPr>
+        <w:t xml:space="preserve"> 2026 – Present</w:t>
       </w:r>
     </w:p>
     <w:p>
@@ -752,65 +1012,7 @@
           <w:sz w:val="21"/>
           <w:szCs w:val="28"/>
         </w:rPr>
-        <w:t>Contributed to architecture decisions, security analysis, testing, deployment and blockchain/application integration.</w:t>
-      </w:r>
-    </w:p>
-    <w:p>
-      <w:pPr>
-        <w:spacing w:before="80" w:after="20"/>
-        <w:rPr>
-          <w:sz w:val="21"/>
-          <w:szCs w:val="28"/>
-        </w:rPr>
-      </w:pPr>
-      <w:r>
-        <w:rPr>
-          <w:b/>
-          <w:sz w:val="21"/>
-          <w:szCs w:val="28"/>
-        </w:rPr>
-        <w:t>G Future Tech | Lead Blockchain Developer</w:t>
-      </w:r>
-      <w:r>
-        <w:rPr>
-          <w:i/>
-          <w:sz w:val="21"/>
-          <w:szCs w:val="28"/>
-        </w:rPr>
-        <w:t xml:space="preserve">  Consultant Freelancer</w:t>
-      </w:r>
-    </w:p>
-    <w:p>
-      <w:pPr>
-        <w:spacing w:after="40"/>
-        <w:rPr>
-          <w:sz w:val="21"/>
-          <w:szCs w:val="28"/>
-        </w:rPr>
-      </w:pPr>
-      <w:r>
-        <w:rPr>
-          <w:sz w:val="21"/>
-          <w:szCs w:val="28"/>
-        </w:rPr>
-        <w:t>Worked on crypto-backed and RWA-backed financial ecosystems, combining smart-contract engineering with protocol architecture, governance, DeFi and blockchain SME responsibilities.</w:t>
-      </w:r>
-    </w:p>
-    <w:p>
-      <w:pPr>
-        <w:spacing w:after="40"/>
-        <w:rPr>
-          <w:sz w:val="21"/>
-          <w:szCs w:val="28"/>
-        </w:rPr>
-      </w:pPr>
-      <w:r>
-        <w:rPr>
-          <w:b/>
-          <w:sz w:val="21"/>
-          <w:szCs w:val="28"/>
-        </w:rPr>
-        <w:t>REAL Governance</w:t>
+        <w:t>Design and develop multi-chain token and RWA infrastructure across EVM and Solana-oriented environments.</w:t>
       </w:r>
     </w:p>
     <w:p>
@@ -832,7 +1034,7 @@
           <w:sz w:val="21"/>
           <w:szCs w:val="28"/>
         </w:rPr>
-        <w:t>Contributed to smart-contract and protocol infrastructure for blockchain-based governance and on-chain execution.</w:t>
+        <w:t>Work across token deployment, bridging, vesting, staking and token lifecycle architecture.</w:t>
       </w:r>
     </w:p>
     <w:p>
@@ -854,24 +1056,7 @@
           <w:sz w:val="21"/>
           <w:szCs w:val="28"/>
         </w:rPr>
-        <w:t>Worked across governance mechanisms, protocol logic, testing, security and deployment workflows.</w:t>
-      </w:r>
-    </w:p>
-    <w:p>
-      <w:pPr>
-        <w:spacing w:after="40"/>
-        <w:rPr>
-          <w:sz w:val="21"/>
-          <w:szCs w:val="28"/>
-        </w:rPr>
-      </w:pPr>
-      <w:r>
-        <w:rPr>
-          <w:b/>
-          <w:sz w:val="21"/>
-          <w:szCs w:val="28"/>
-        </w:rPr>
-        <w:t>USDAO</w:t>
+        <w:t>Contribute to CREATE2 deterministic deployment and LayerZero V2/OFT-oriented cross-chain architecture.</w:t>
       </w:r>
     </w:p>
     <w:p>
@@ -893,7 +1078,7 @@
           <w:sz w:val="21"/>
           <w:szCs w:val="28"/>
         </w:rPr>
-        <w:t>Contributed to crypto-backed and RWA-backed financial infrastructure, including stablecoin and DeFi mechanisms.</w:t>
+        <w:t>Build and support deployment automation, contract verification, testing, security review and audit handoff.</w:t>
       </w:r>
     </w:p>
     <w:p>
@@ -915,7 +1100,105 @@
           <w:sz w:val="21"/>
           <w:szCs w:val="28"/>
         </w:rPr>
-        <w:t>Worked across collateralization, lending/borrowing, liquidity, governance, oracle integration and liquidation/recovery mechanisms.</w:t>
+        <w:t>Translate business requirements into blockchain architecture and provide technical consulting.</w:t>
+      </w:r>
+    </w:p>
+    <w:p>
+      <w:pPr>
+        <w:spacing w:after="40"/>
+        <w:rPr>
+          <w:sz w:val="21"/>
+          <w:szCs w:val="28"/>
+        </w:rPr>
+      </w:pPr>
+      <w:r>
+        <w:rPr>
+          <w:b/>
+          <w:sz w:val="21"/>
+          <w:szCs w:val="28"/>
+        </w:rPr>
+        <w:t>Featured:</w:t>
+      </w:r>
+      <w:r>
+        <w:rPr>
+          <w:sz w:val="21"/>
+          <w:szCs w:val="28"/>
+        </w:rPr>
+        <w:t xml:space="preserve"> RBC / FRK — Multi-Chain Token Infrastructure</w:t>
+      </w:r>
+    </w:p>
+    <w:p>
+      <w:pPr>
+        <w:spacing w:after="40"/>
+        <w:rPr>
+          <w:sz w:val="21"/>
+          <w:szCs w:val="28"/>
+        </w:rPr>
+      </w:pPr>
+      <w:r>
+        <w:rPr>
+          <w:sz w:val="21"/>
+          <w:szCs w:val="28"/>
+        </w:rPr>
+        <w:t>Multi-chain token deployment, deterministic CREATE2 architecture, cross-chain infrastructure, LayerZero-oriented design, deployment automation and contract verification.</w:t>
+      </w:r>
+    </w:p>
+    <w:p>
+      <w:pPr>
+        <w:spacing w:before="80" w:after="20"/>
+        <w:rPr>
+          <w:sz w:val="21"/>
+          <w:szCs w:val="28"/>
+        </w:rPr>
+      </w:pPr>
+      <w:r>
+        <w:rPr>
+          <w:b/>
+          <w:sz w:val="21"/>
+          <w:szCs w:val="28"/>
+        </w:rPr>
+        <w:t>G Future Tech | Blockchain Consultant &amp; SME (Freelance)</w:t>
+      </w:r>
+      <w:r>
+        <w:rPr>
+          <w:i/>
+          <w:sz w:val="21"/>
+          <w:szCs w:val="28"/>
+        </w:rPr>
+        <w:t xml:space="preserve">  Oct 2024 – Jul 2026</w:t>
+      </w:r>
+    </w:p>
+    <w:p>
+      <w:pPr>
+        <w:spacing w:after="40"/>
+        <w:rPr>
+          <w:sz w:val="21"/>
+          <w:szCs w:val="28"/>
+        </w:rPr>
+      </w:pPr>
+      <w:r>
+        <w:rPr>
+          <w:sz w:val="21"/>
+          <w:szCs w:val="28"/>
+        </w:rPr>
+        <w:t>Freelance consulting and SME engagement, following an earlier role at G Future Tech (2021–2022), across crypto-backed and RWA-backed financial ecosystems, combining smart-contract engineering with protocol architecture, governance and DeFi.</w:t>
+      </w:r>
+    </w:p>
+    <w:p>
+      <w:pPr>
+        <w:spacing w:after="40"/>
+        <w:rPr>
+          <w:sz w:val="21"/>
+          <w:szCs w:val="28"/>
+        </w:rPr>
+      </w:pPr>
+      <w:r>
+        <w:rPr>
+          <w:b/>
+          <w:sz w:val="21"/>
+          <w:szCs w:val="28"/>
+        </w:rPr>
+        <w:t>REAL Governance</w:t>
       </w:r>
     </w:p>
     <w:p>
@@ -937,24 +1220,7 @@
           <w:sz w:val="21"/>
           <w:szCs w:val="28"/>
         </w:rPr>
-        <w:t>Contributed to smart-contract architecture, protocol development, security analysis and deployment.</w:t>
-      </w:r>
-    </w:p>
-    <w:p>
-      <w:pPr>
-        <w:spacing w:after="40"/>
-        <w:rPr>
-          <w:sz w:val="21"/>
-          <w:szCs w:val="28"/>
-        </w:rPr>
-      </w:pPr>
-      <w:r>
-        <w:rPr>
-          <w:b/>
-          <w:sz w:val="21"/>
-          <w:szCs w:val="28"/>
-        </w:rPr>
-        <w:t>Technical Leadership</w:t>
+        <w:t>Contributed to smart-contract and protocol infrastructure for blockchain-based governance and on-chain execution.</w:t>
       </w:r>
     </w:p>
     <w:p>
@@ -976,7 +1242,24 @@
           <w:sz w:val="21"/>
           <w:szCs w:val="28"/>
         </w:rPr>
-        <w:t>Provided blockchain SME expertise and technical guidance across architecture and implementation decisions.</w:t>
+        <w:t>Worked across governance mechanisms, protocol logic, testing, security and deployment workflows.</w:t>
+      </w:r>
+    </w:p>
+    <w:p>
+      <w:pPr>
+        <w:spacing w:after="40"/>
+        <w:rPr>
+          <w:sz w:val="21"/>
+          <w:szCs w:val="28"/>
+        </w:rPr>
+      </w:pPr>
+      <w:r>
+        <w:rPr>
+          <w:b/>
+          <w:sz w:val="21"/>
+          <w:szCs w:val="28"/>
+        </w:rPr>
+        <w:t>USDAO</w:t>
       </w:r>
     </w:p>
     <w:p>
@@ -998,7 +1281,7 @@
           <w:sz w:val="21"/>
           <w:szCs w:val="28"/>
         </w:rPr>
-        <w:t>Translated product requirements into blockchain solutions and collaborated with engineering/product stakeholders.</w:t>
+        <w:t>Contributed to crypto-backed and RWA-backed financial infrastructure, including stablecoin and DeFi mechanisms.</w:t>
       </w:r>
     </w:p>
     <w:p>
@@ -1020,32 +1303,7 @@
           <w:sz w:val="21"/>
           <w:szCs w:val="28"/>
         </w:rPr>
-        <w:t>Supported testing, security reviews, audit preparation and production-oriented deployment.</w:t>
-      </w:r>
-    </w:p>
-    <w:p>
-      <w:pPr>
-        <w:spacing w:before="80" w:after="20"/>
-        <w:rPr>
-          <w:sz w:val="21"/>
-          <w:szCs w:val="28"/>
-        </w:rPr>
-      </w:pPr>
-      <w:r>
-        <w:rPr>
-          <w:b/>
-          <w:sz w:val="21"/>
-          <w:szCs w:val="28"/>
-        </w:rPr>
-        <w:t>Brane Enterprises Pvt. Ltd. | Senior Blockchain Developer</w:t>
-      </w:r>
-      <w:r>
-        <w:rPr>
-          <w:i/>
-          <w:sz w:val="21"/>
-          <w:szCs w:val="28"/>
-        </w:rPr>
-        <w:t xml:space="preserve">  Aug 2022 – Nov 2024</w:t>
+        <w:t>Worked across collateralization, lending/borrowing, liquidity, governance, oracle integration and liquidation/recovery mechanisms.</w:t>
       </w:r>
     </w:p>
     <w:p>
@@ -1067,7 +1325,24 @@
           <w:sz w:val="21"/>
           <w:szCs w:val="28"/>
         </w:rPr>
-        <w:t>Designed, developed, tested and deployed Solidity smart contracts and decentralized applications.</w:t>
+        <w:t>Contributed to smart-contract architecture, protocol development, security analysis and deployment.</w:t>
+      </w:r>
+    </w:p>
+    <w:p>
+      <w:pPr>
+        <w:spacing w:after="40"/>
+        <w:rPr>
+          <w:sz w:val="21"/>
+          <w:szCs w:val="28"/>
+        </w:rPr>
+      </w:pPr>
+      <w:r>
+        <w:rPr>
+          <w:b/>
+          <w:sz w:val="21"/>
+          <w:szCs w:val="28"/>
+        </w:rPr>
+        <w:t>Consulting &amp; SME Contribution</w:t>
       </w:r>
     </w:p>
     <w:p>
@@ -1089,7 +1364,7 @@
           <w:sz w:val="21"/>
           <w:szCs w:val="28"/>
         </w:rPr>
-        <w:t>Worked across token infrastructure, Web3 integrations and EVM-compatible blockchain environments.</w:t>
+        <w:t>Provided blockchain SME expertise and technical guidance across architecture and implementation decisions.</w:t>
       </w:r>
     </w:p>
     <w:p>
@@ -1111,7 +1386,7 @@
           <w:sz w:val="21"/>
           <w:szCs w:val="28"/>
         </w:rPr>
-        <w:t>Contributed to smart-contract architecture, security reviews, vulnerability analysis and gas optimization.</w:t>
+        <w:t>Translated product requirements into blockchain solutions and collaborated with engineering/product stakeholders.</w:t>
       </w:r>
     </w:p>
     <w:p>
@@ -1133,7 +1408,7 @@
           <w:sz w:val="21"/>
           <w:szCs w:val="28"/>
         </w:rPr>
-        <w:t>Supported blockchain integrations, deployment and production troubleshooting.</w:t>
+        <w:t>Supported testing, security reviews, audit preparation and production-oriented deployment.</w:t>
       </w:r>
     </w:p>
     <w:p>
@@ -1150,7 +1425,7 @@
           <w:sz w:val="21"/>
           <w:szCs w:val="28"/>
         </w:rPr>
-        <w:t>G Future Tech Pvt. Ltd. | Blockchain Developer</w:t>
+        <w:t>RealProton | Blockchain Consultant &amp; SME (Consulting)</w:t>
       </w:r>
       <w:r>
         <w:rPr>
@@ -1158,12 +1433,17 @@
           <w:sz w:val="21"/>
           <w:szCs w:val="28"/>
         </w:rPr>
-        <w:t xml:space="preserve">  Apr 2021 – Aug 2022</w:t>
+        <w:t xml:space="preserve"/>
       </w:r>
     </w:p>
     <w:p>
       <w:pPr>
-        <w:spacing w:after="40"/>
+        <w:pStyle w:val="ListBullet"/>
+        <w:tabs>
+          <w:tab w:val="clear" w:pos="360"/>
+          <w:tab w:val="num" w:pos="821"/>
+        </w:tabs>
+        <w:spacing w:after="20"/>
         <w:ind w:left="720"/>
         <w:rPr>
           <w:sz w:val="21"/>
@@ -1175,12 +1455,18 @@
           <w:sz w:val="21"/>
           <w:szCs w:val="28"/>
         </w:rPr>
-        <w:t>Developed Solidity smart contracts and blockchain applications across EVM environments, supporting token functionality, Web3 integration, testing, deployment, verification and security analysis.</w:t>
+        <w:t>Provided SME guidance on ERC-3643 identity, claims, registry, compliance and controlled-transfer design for real-estate tokenization.</w:t>
       </w:r>
     </w:p>
     <w:p>
       <w:pPr>
-        <w:spacing w:before="80" w:after="20"/>
+        <w:pStyle w:val="ListBullet"/>
+        <w:tabs>
+          <w:tab w:val="clear" w:pos="360"/>
+          <w:tab w:val="num" w:pos="821"/>
+        </w:tabs>
+        <w:spacing w:after="20"/>
+        <w:ind w:left="720"/>
         <w:rPr>
           <w:sz w:val="21"/>
           <w:szCs w:val="28"/>
@@ -1188,78 +1474,10 @@
       </w:pPr>
       <w:r>
         <w:rPr>
-          <w:b/>
-          <w:sz w:val="21"/>
-          <w:szCs w:val="28"/>
-        </w:rPr>
-        <w:t>Zeromile Research &amp; Development LLC | Blockchain Developer</w:t>
-      </w:r>
-      <w:r>
-        <w:rPr>
-          <w:i/>
-          <w:sz w:val="21"/>
-          <w:szCs w:val="28"/>
-        </w:rPr>
-        <w:t xml:space="preserve">  Feb 2021 – Mar 2021</w:t>
-      </w:r>
-    </w:p>
-    <w:p>
-      <w:pPr>
-        <w:spacing w:after="40"/>
-        <w:ind w:firstLine="720"/>
-        <w:rPr>
-          <w:sz w:val="21"/>
-          <w:szCs w:val="28"/>
-        </w:rPr>
-      </w:pPr>
-      <w:r>
-        <w:rPr>
-          <w:sz w:val="21"/>
-          <w:szCs w:val="28"/>
-        </w:rPr>
-        <w:t>Contributed to smart-contract development, decentralized application implementation, testing and blockchain integration.</w:t>
-      </w:r>
-    </w:p>
-    <w:p>
-      <w:pPr>
-        <w:spacing w:before="80" w:after="20"/>
-        <w:rPr>
-          <w:sz w:val="21"/>
-          <w:szCs w:val="28"/>
-        </w:rPr>
-      </w:pPr>
-      <w:r>
-        <w:rPr>
-          <w:b/>
-          <w:sz w:val="21"/>
-          <w:szCs w:val="28"/>
-        </w:rPr>
-        <w:t>ThynkBlynk Technologies | Blockchain Intern</w:t>
-      </w:r>
-      <w:r>
-        <w:rPr>
-          <w:i/>
-          <w:sz w:val="21"/>
-          <w:szCs w:val="28"/>
-        </w:rPr>
-        <w:t xml:space="preserve">  Sep 2020 – Dec 2020</w:t>
-      </w:r>
-    </w:p>
-    <w:p>
-      <w:pPr>
-        <w:spacing w:after="40"/>
-        <w:ind w:firstLine="720"/>
-        <w:rPr>
-          <w:sz w:val="21"/>
-          <w:szCs w:val="28"/>
-        </w:rPr>
-      </w:pPr>
-      <w:r>
-        <w:rPr>
-          <w:sz w:val="21"/>
-          <w:szCs w:val="28"/>
-        </w:rPr>
-        <w:t>Built foundational hands-on experience in Solidity, smart contracts and decentralized application development.</w:t>
+          <w:sz w:val="21"/>
+          <w:szCs w:val="28"/>
+        </w:rPr>
+        <w:t>Advised on Fireblocks custody architecture and supported audit preparation, redeployment, verification and Avalanche deployment.</w:t>
       </w:r>
     </w:p>
     <w:p>
@@ -1289,42 +1507,7 @@
           <w:sz w:val="28"/>
           <w:szCs w:val="28"/>
         </w:rPr>
-        <w:lastRenderedPageBreak/>
         <w:t>SELECTED BLOCKCHAIN ARCHITECTURE &amp; PROJECTS</w:t>
-      </w:r>
-    </w:p>
-    <w:p>
-      <w:pPr>
-        <w:spacing w:after="40"/>
-        <w:rPr>
-          <w:sz w:val="21"/>
-          <w:szCs w:val="28"/>
-        </w:rPr>
-      </w:pPr>
-      <w:r>
-        <w:rPr>
-          <w:b/>
-          <w:sz w:val="21"/>
-          <w:szCs w:val="28"/>
-        </w:rPr>
-        <w:t>RealProton — RWA / ERC-3643 Tokenization</w:t>
-      </w:r>
-    </w:p>
-    <w:p>
-      <w:pPr>
-        <w:spacing w:after="40"/>
-        <w:ind w:left="720"/>
-        <w:rPr>
-          <w:sz w:val="21"/>
-          <w:szCs w:val="28"/>
-        </w:rPr>
-      </w:pPr>
-      <w:r>
-        <w:rPr>
-          <w:sz w:val="21"/>
-          <w:szCs w:val="28"/>
-        </w:rPr>
-        <w:t>Compliance-oriented real-estate tokenization involving ERC-3643 concepts, identity/claims, registry and compliance controls, whitelisting, controlled transfers, Fireblocks custody architecture, security testing and Avalanche deployment.</w:t>
       </w:r>
     </w:p>
     <w:p>

</xml_diff>